<commit_message>
docs: assign real member names (Abdul Ahad=Auth, Touseef Abbas=Sharing) to per-member reports
</commit_message>
<xml_diff>
--- a/docs/CloudDrive_Report_1_Authentication.docx
+++ b/docs/CloudDrive_Report_1_Authentication.docx
@@ -52,7 +52,7 @@
         <w:rPr>
           <w:sz w:val="22"/>
         </w:rPr>
-        <w:t>Prepared by: Member 1</w:t>
+        <w:t>Prepared by: Abdul Ahad</w:t>
         <w:br/>
         <w:t>Project: CloudDrive — Scalable File Storage on AWS</w:t>
         <w:br/>
@@ -358,7 +358,7 @@
               <w:rPr>
                 <w:sz w:val="18"/>
               </w:rPr>
-              <w:t>Member 1 (this report)</w:t>
+              <w:t>Abdul Ahad (this report)</w:t>
             </w:r>
           </w:p>
         </w:tc>
@@ -418,7 +418,7 @@
               <w:rPr>
                 <w:sz w:val="18"/>
               </w:rPr>
-              <w:t>Member 3</w:t>
+              <w:t>Touseef Abbas</w:t>
             </w:r>
           </w:p>
         </w:tc>

</xml_diff>

<commit_message>
docs: swap roles (Touseef=Auth, Abdul Ahad=Sharing) and move Docker setup into Abdul's report
</commit_message>
<xml_diff>
--- a/docs/CloudDrive_Report_1_Authentication.docx
+++ b/docs/CloudDrive_Report_1_Authentication.docx
@@ -52,7 +52,7 @@
         <w:rPr>
           <w:sz w:val="22"/>
         </w:rPr>
-        <w:t>Prepared by: Abdul Ahad</w:t>
+        <w:t>Prepared by: Touseef Abbas</w:t>
         <w:br/>
         <w:t>Project: CloudDrive — Scalable File Storage on AWS</w:t>
         <w:br/>
@@ -358,7 +358,7 @@
               <w:rPr>
                 <w:sz w:val="18"/>
               </w:rPr>
-              <w:t>Abdul Ahad (this report)</w:t>
+              <w:t>Touseef Abbas (this report)</w:t>
             </w:r>
           </w:p>
         </w:tc>
@@ -404,7 +404,7 @@
               <w:rPr>
                 <w:sz w:val="18"/>
               </w:rPr>
-              <w:t>Sharing &amp; Collaboration</w:t>
+              <w:t>Sharing &amp; Collaboration (+ Docker/Deployment)</w:t>
             </w:r>
           </w:p>
         </w:tc>
@@ -418,7 +418,7 @@
               <w:rPr>
                 <w:sz w:val="18"/>
               </w:rPr>
-              <w:t>Touseef Abbas</w:t>
+              <w:t>Abdul Ahad</w:t>
             </w:r>
           </w:p>
         </w:tc>

</xml_diff>